<commit_message>
Add signature re-sign flow & custom alerts
Implements pre-submit applicant-signature checks and an admin-driven per-document re-sign workflow plus user-configurable expiry alerts. Key changes: new SignatureWorkflowService helpers (isApplicantSignatureCompleted, areApplicantSignaturesComplete, getUnsignedApplicantDocTypes) and requestDocumentResign; SignatureNotifier.notifyResignRequested; admin endpoints in AcademicAdminController/PositionAdminController; applicant controllers enforce signature gate; CustomExpiryAlert model, UserDtls.customExpiryAlerts, and AcademicSettingsController APIs (add/toggle/delete) with frontend modal; many UI/CSS template refinements (back buttons, resign modal, badges, dark theme); email/notification guards for disabled accounts; SSO case-insensitive lookup; PositionRequestService doc list updates; added/updated tests.
</commit_message>
<xml_diff>
--- a/HRCP-KKU-Academic/uploads/academic/position/1/p2doc_5.docx
+++ b/HRCP-KKU-Academic/uploads/academic/position/1/p2doc_5.docx
@@ -94,7 +94,7 @@
           <w:sz w:val="32"/>
           <w:szCs w:val="32"/>
         </w:rPr>
-        <w:t>ศาสตราจารย์</w:t>
+        <w:t>ผู้ช่วยศาสตราจารย์</w:t>
       </w:r>
     </w:p>
     <w:p>
@@ -175,7 +175,7 @@
           <w:sz w:val="32"/>
           <w:szCs w:val="32"/>
         </w:rPr>
-        <w:t>คอม</w:t>
+        <w:t>วิทยาการคอมพิวเตอร์</w:t>
       </w:r>
       <w:r>
         <w:rPr>
@@ -192,7 +192,7 @@
           <w:sz w:val="32"/>
           <w:szCs w:val="32"/>
         </w:rPr>
-        <w:t>123</w:t>
+        <w:t>CS12345</w:t>
       </w:r>
       <w:r>
         <w:rPr>
@@ -229,7 +229,7 @@
           <w:sz w:val="32"/>
           <w:szCs w:val="32"/>
         </w:rPr>
-        <w:t>คอม</w:t>
+        <w:t>computer sci</w:t>
       </w:r>
       <w:r>
         <w:rPr>
@@ -255,7 +255,7 @@
           <w:sz w:val="32"/>
           <w:szCs w:val="32"/>
         </w:rPr>
-        <w:t/>
+        <w:t>CP123222</w:t>
       </w:r>
       <w:r>
         <w:rPr>
@@ -292,7 +292,7 @@
           <w:sz w:val="32"/>
           <w:szCs w:val="32"/>
         </w:rPr>
-        <w:t>นาง</w:t>
+        <w:t>ผู้ช่วยศาสตราจารย์</w:t>
       </w:r>
       <w:r>
         <w:rPr>
@@ -318,7 +318,7 @@
           <w:sz w:val="32"/>
           <w:szCs w:val="32"/>
         </w:rPr>
-        <w:t>ดดดดดดด</w:t>
+        <w:t>สมชาย ใจดีวิชาการ</w:t>
       </w:r>
     </w:p>
     <w:p>
@@ -355,7 +355,7 @@
           <w:sz w:val="32"/>
           <w:szCs w:val="32"/>
         </w:rPr>
-        <w:t>ดดดดดดด</w:t>
+        <w:t>สาขาวิทยาการคอมพิวเตอร์</w:t>
       </w:r>
       <w:r>
         <w:rPr>
@@ -498,7 +498,7 @@
           <w:sz w:val="32"/>
           <w:szCs w:val="32"/>
         </w:rPr>
-        <w:t>ผศ</w:t>
+        <w:t>ผู้ช่วยศาสตราจารย์</w:t>
       </w:r>
       <w:r>
         <w:rPr>
@@ -536,7 +536,7 @@
           <w:sz w:val="32"/>
           <w:szCs w:val="32"/>
         </w:rPr>
-        <w:t>นาย</w:t>
+        <w:t>ผู้ช่วยศาสตราจารย์</w:t>
       </w:r>
       <w:r>
         <w:rPr>
@@ -554,7 +554,7 @@
           <w:sz w:val="32"/>
           <w:szCs w:val="32"/>
         </w:rPr>
-        <w:t>นายก</w:t>
+        <w:t>สมชาย ใจดีวิชาการ</w:t>
       </w:r>
     </w:p>
     <w:p>
@@ -701,7 +701,7 @@
           <w:sz w:val="32"/>
           <w:szCs w:val="32"/>
         </w:rPr>
-        <w:t>ดดดดด</w:t>
+        <w:t/>
       </w:r>
       <w:r>
         <w:rPr>
@@ -779,97 +779,20 @@
         <w:spacing w:after="0" w:line="240" w:lineRule="auto"/>
         <w:jc w:val="center"/>
         <w:rPr>
-          <w:rFonts w:ascii="TH Sarabun New" w:hAnsi="TH Sarabun New" w:cs="TH Sarabun New"/>
-          <w:color w:val="000000" w:themeColor="text1"/>
-          <w:sz w:val="32"/>
-          <w:szCs w:val="32"/>
-        </w:rPr>
-      </w:pPr>
-      <w:r>
-        <w:rPr>
-          <w:rFonts w:ascii="TH Sarabun New" w:hAnsi="TH Sarabun New" w:cs="TH Sarabun New"/>
-          <w:color w:val="000000" w:themeColor="text1"/>
-          <w:sz w:val="32"/>
-          <w:szCs w:val="32"/>
-          <w:cs/>
-        </w:rPr>
-        <w:t>วันที่</w:t>
-      </w:r>
-      <w:r>
-        <w:rPr>
-          <w:rFonts w:ascii="Roboto Mono" w:hAnsi="Roboto Mono"/>
-          <w:color w:val="000000" w:themeColor="text1"/>
-          <w:sz w:val="21"/>
-          <w:szCs w:val="21"/>
-        </w:rPr>
-        <w:t xml:space="preserve"> </w:t>
-      </w:r>
-      <w:r>
-        <w:rPr>
-          <w:rFonts w:ascii="TH Sarabun New" w:hAnsi="TH Sarabun New" w:cs="TH Sarabun New"/>
-          <w:color w:val="000000" w:themeColor="text1"/>
-          <w:sz w:val="32"/>
-          <w:szCs w:val="32"/>
-        </w:rPr>
-        <w:t>วันที่ ๒๕ มีนาคม พ.ศ. ๒๕๖๙</w:t>
-      </w:r>
-      <w:r>
-        <w:rPr>
-          <w:rFonts w:ascii="TH Sarabun New" w:hAnsi="TH Sarabun New" w:cs="TH Sarabun New"/>
-          <w:color w:val="000000" w:themeColor="text1"/>
-          <w:sz w:val="32"/>
-          <w:szCs w:val="32"/>
-          <w:cs/>
-        </w:rPr>
-        <w:t xml:space="preserve"> </w:t>
-      </w:r>
-      <w:r>
-        <w:rPr>
-          <w:rFonts w:ascii="TH Sarabun New" w:hAnsi="TH Sarabun New" w:cs="TH Sarabun New"/>
-          <w:color w:val="000000" w:themeColor="text1"/>
-          <w:sz w:val="32"/>
-          <w:szCs w:val="32"/>
-          <w:cs/>
-        </w:rPr>
-        <w:t>เดือน</w:t>
-      </w:r>
-      <w:r>
-        <w:rPr>
-          <w:rFonts w:ascii="TH Sarabun New" w:hAnsi="TH Sarabun New" w:cs="TH Sarabun New"/>
-          <w:color w:val="000000" w:themeColor="text1"/>
-          <w:sz w:val="32"/>
-          <w:szCs w:val="32"/>
-        </w:rPr>
-        <w:t/>
-      </w:r>
-      <w:r>
-        <w:rPr>
-          <w:rFonts w:ascii="TH Sarabun New" w:hAnsi="TH Sarabun New" w:cs="TH Sarabun New"/>
-          <w:color w:val="000000" w:themeColor="text1"/>
-          <w:sz w:val="32"/>
-          <w:szCs w:val="32"/>
-          <w:cs/>
-        </w:rPr>
-        <w:t xml:space="preserve"> </w:t>
-      </w:r>
-      <w:r>
-        <w:rPr>
-          <w:rFonts w:ascii="TH Sarabun New" w:hAnsi="TH Sarabun New" w:cs="TH Sarabun New"/>
-          <w:color w:val="000000" w:themeColor="text1"/>
-          <w:sz w:val="32"/>
-          <w:szCs w:val="32"/>
-          <w:cs/>
-        </w:rPr>
-        <w:t>พ.ศ.</w:t>
-      </w:r>
-      <w:r>
-        <w:rPr>
-          <w:rFonts w:ascii="TH Sarabun New" w:hAnsi="TH Sarabun New" w:cs="TH Sarabun New"/>
-          <w:color w:val="000000" w:themeColor="text1"/>
-          <w:sz w:val="32"/>
-          <w:szCs w:val="32"/>
-        </w:rPr>
-        <w:t/>
+          <w:rFonts w:ascii="TH Sarabun New" w:hAnsi="TH Sarabun New" w:cs="TH Sarabun New" w:hint="cs"/>
+          <w:color w:val="000000" w:themeColor="text1"/>
+          <w:sz w:val="32"/>
+          <w:szCs w:val="32"/>
+        </w:rPr>
+      </w:pPr>
+      <w:r>
+        <w:rPr>
+          <w:rFonts w:ascii="TH Sarabun New" w:hAnsi="TH Sarabun New" w:cs="TH Sarabun New"/>
+          <w:color w:val="000000" w:themeColor="text1"/>
+          <w:sz w:val="32"/>
+          <w:szCs w:val="32"/>
+        </w:rPr>
+        <w:t>วันที่ ๒๑ สิงหาคม พ.ศ. ๒๕๖๙</w:t>
       </w:r>
     </w:p>
     <w:p>
@@ -946,7 +869,7 @@
           <w:sz w:val="32"/>
           <w:szCs w:val="32"/>
         </w:rPr>
-        <w:t>นาง</w:t>
+        <w:t>ผู้ช่วยศาสตราจารย์</w:t>
       </w:r>
       <w:r>
         <w:rPr>
@@ -964,7 +887,7 @@
           <w:sz w:val="32"/>
           <w:szCs w:val="32"/>
         </w:rPr>
-        <w:t>ดดดดดดดดด</w:t>
+        <w:t>สมชาย ใจดีวิชาการ</w:t>
       </w:r>
     </w:p>
     <w:p>
@@ -1039,7 +962,7 @@
           <w:sz w:val="32"/>
           <w:szCs w:val="32"/>
         </w:rPr>
-        <w:t>ผศ</w:t>
+        <w:t>ผู้ช่วยศาสตราจารย์</w:t>
       </w:r>
     </w:p>
     <w:p>
@@ -1111,7 +1034,7 @@
           <w:sz w:val="32"/>
           <w:szCs w:val="32"/>
         </w:rPr>
-        <w:t>สิรภัทร</w:t>
+        <w:t/>
       </w:r>
       <w:r>
         <w:rPr>
@@ -1189,107 +1112,20 @@
         <w:spacing w:after="0" w:line="240" w:lineRule="auto"/>
         <w:jc w:val="center"/>
         <w:rPr>
-          <w:rFonts w:ascii="TH Sarabun New" w:hAnsi="TH Sarabun New" w:cs="TH Sarabun New"/>
-          <w:color w:val="000000" w:themeColor="text1"/>
-          <w:sz w:val="32"/>
-          <w:szCs w:val="32"/>
-          <w:cs/>
-        </w:rPr>
-      </w:pPr>
-      <w:r>
-        <w:rPr>
-          <w:rFonts w:ascii="TH Sarabun New" w:hAnsi="TH Sarabun New" w:cs="TH Sarabun New"/>
-          <w:color w:val="000000" w:themeColor="text1"/>
-          <w:sz w:val="32"/>
-          <w:szCs w:val="32"/>
-          <w:cs/>
-        </w:rPr>
-        <w:t>วันที่</w:t>
-      </w:r>
-      <w:r>
-        <w:rPr>
-          <w:rFonts w:ascii="Roboto Mono" w:hAnsi="Roboto Mono"/>
-          <w:color w:val="000000" w:themeColor="text1"/>
-          <w:sz w:val="21"/>
-          <w:szCs w:val="21"/>
-        </w:rPr>
-        <w:t xml:space="preserve"> </w:t>
-      </w:r>
-      <w:r>
-        <w:rPr>
-          <w:rFonts w:ascii="TH Sarabun New" w:hAnsi="TH Sarabun New" w:cs="TH Sarabun New"/>
-          <w:color w:val="000000" w:themeColor="text1"/>
-          <w:sz w:val="32"/>
-          <w:szCs w:val="32"/>
-        </w:rPr>
-        <w:t>วันที่ ๒๕ มีนาคม พ.ศ. ๒๕๖๙</w:t>
-      </w:r>
-      <w:r>
-        <w:rPr>
-          <w:rFonts w:ascii="TH Sarabun New" w:hAnsi="TH Sarabun New" w:cs="TH Sarabun New"/>
-          <w:color w:val="000000" w:themeColor="text1"/>
-          <w:sz w:val="32"/>
-          <w:szCs w:val="32"/>
-          <w:cs/>
-        </w:rPr>
-        <w:t xml:space="preserve"> </w:t>
-      </w:r>
-      <w:r>
-        <w:rPr>
-          <w:rFonts w:ascii="TH Sarabun New" w:hAnsi="TH Sarabun New" w:cs="TH Sarabun New"/>
-          <w:color w:val="000000" w:themeColor="text1"/>
-          <w:sz w:val="32"/>
-          <w:szCs w:val="32"/>
-          <w:cs/>
-        </w:rPr>
-        <w:t>เดือน</w:t>
-      </w:r>
-      <w:r>
-        <w:rPr>
-          <w:rFonts w:ascii="Roboto Mono" w:hAnsi="Roboto Mono"/>
-          <w:color w:val="000000" w:themeColor="text1"/>
-          <w:sz w:val="21"/>
-          <w:szCs w:val="21"/>
-        </w:rPr>
-        <w:t xml:space="preserve"> </w:t>
-      </w:r>
-      <w:r>
-        <w:rPr>
-          <w:rFonts w:ascii="TH Sarabun New" w:hAnsi="TH Sarabun New" w:cs="TH Sarabun New"/>
-          <w:color w:val="000000" w:themeColor="text1"/>
-          <w:sz w:val="32"/>
-          <w:szCs w:val="32"/>
-        </w:rPr>
-        <w:t/>
-      </w:r>
-      <w:r>
-        <w:rPr>
-          <w:rFonts w:ascii="TH Sarabun New" w:hAnsi="TH Sarabun New" w:cs="TH Sarabun New"/>
-          <w:color w:val="000000" w:themeColor="text1"/>
-          <w:sz w:val="32"/>
-          <w:szCs w:val="32"/>
-          <w:cs/>
-        </w:rPr>
-        <w:t xml:space="preserve"> </w:t>
-      </w:r>
-      <w:r>
-        <w:rPr>
-          <w:rFonts w:ascii="TH Sarabun New" w:hAnsi="TH Sarabun New" w:cs="TH Sarabun New"/>
-          <w:color w:val="000000" w:themeColor="text1"/>
-          <w:sz w:val="32"/>
-          <w:szCs w:val="32"/>
-          <w:cs/>
-        </w:rPr>
-        <w:t>พ.ศ.</w:t>
-      </w:r>
-      <w:r>
-        <w:rPr>
-          <w:rFonts w:ascii="TH Sarabun New" w:hAnsi="TH Sarabun New" w:cs="TH Sarabun New"/>
-          <w:color w:val="000000" w:themeColor="text1"/>
-          <w:sz w:val="32"/>
-          <w:szCs w:val="32"/>
-        </w:rPr>
-        <w:t/>
+          <w:rFonts w:ascii="TH Sarabun New" w:hAnsi="TH Sarabun New" w:cs="TH Sarabun New" w:hint="cs"/>
+          <w:color w:val="000000" w:themeColor="text1"/>
+          <w:sz w:val="32"/>
+          <w:szCs w:val="32"/>
+        </w:rPr>
+      </w:pPr>
+      <w:r>
+        <w:rPr>
+          <w:rFonts w:ascii="TH Sarabun New" w:hAnsi="TH Sarabun New" w:cs="TH Sarabun New"/>
+          <w:color w:val="000000" w:themeColor="text1"/>
+          <w:sz w:val="32"/>
+          <w:szCs w:val="32"/>
+        </w:rPr>
+        <w:t>วันที่ ๒๑ สิงหาคม พ.ศ. ๒๕๖๙</w:t>
       </w:r>
     </w:p>
     <w:sectPr>
@@ -2193,16 +2029,16 @@
     <w:lsdException w:name="Unresolved Mention" w:semiHidden="1" w:unhideWhenUsed="1"/>
     <w:lsdException w:name="Smart Link" w:semiHidden="1" w:unhideWhenUsed="1"/>
   </w:latentStyles>
-  <w:style w:type="paragraph" w:default="1" w:styleId="Normal">
+  <w:style w:type="paragraph" w:default="1" w:styleId="a">
     <w:name w:val="Normal"/>
     <w:qFormat/>
     <w:rsid w:val="00EA52CC"/>
   </w:style>
-  <w:style w:type="paragraph" w:styleId="Heading1">
+  <w:style w:type="paragraph" w:styleId="1">
     <w:name w:val="heading 1"/>
-    <w:basedOn w:val="Normal"/>
-    <w:next w:val="Normal"/>
-    <w:link w:val="Heading1Char"/>
+    <w:basedOn w:val="a"/>
+    <w:next w:val="a"/>
+    <w:link w:val="10"/>
     <w:qFormat/>
     <w:rsid w:val="009A19D5"/>
     <w:pPr>
@@ -2218,13 +2054,13 @@
       <w:szCs w:val="32"/>
     </w:rPr>
   </w:style>
-  <w:style w:type="character" w:default="1" w:styleId="DefaultParagraphFont">
+  <w:style w:type="character" w:default="1" w:styleId="a0">
     <w:name w:val="Default Paragraph Font"/>
     <w:uiPriority w:val="1"/>
     <w:semiHidden/>
     <w:unhideWhenUsed/>
   </w:style>
-  <w:style w:type="table" w:default="1" w:styleId="TableNormal">
+  <w:style w:type="table" w:default="1" w:styleId="a1">
     <w:name w:val="Normal Table"/>
     <w:uiPriority w:val="99"/>
     <w:semiHidden/>
@@ -2239,15 +2075,15 @@
       </w:tblCellMar>
     </w:tblPr>
   </w:style>
-  <w:style w:type="numbering" w:default="1" w:styleId="NoList">
+  <w:style w:type="numbering" w:default="1" w:styleId="a2">
     <w:name w:val="No List"/>
     <w:uiPriority w:val="99"/>
     <w:semiHidden/>
     <w:unhideWhenUsed/>
   </w:style>
-  <w:style w:type="paragraph" w:styleId="ListParagraph">
+  <w:style w:type="paragraph" w:styleId="a3">
     <w:name w:val="List Paragraph"/>
-    <w:basedOn w:val="Normal"/>
+    <w:basedOn w:val="a"/>
     <w:uiPriority w:val="34"/>
     <w:qFormat/>
     <w:rsid w:val="00EA52CC"/>
@@ -2256,10 +2092,10 @@
       <w:contextualSpacing/>
     </w:pPr>
   </w:style>
-  <w:style w:type="paragraph" w:styleId="Header">
+  <w:style w:type="paragraph" w:styleId="a4">
     <w:name w:val="header"/>
-    <w:basedOn w:val="Normal"/>
-    <w:link w:val="HeaderChar"/>
+    <w:basedOn w:val="a"/>
+    <w:link w:val="a5"/>
     <w:uiPriority w:val="99"/>
     <w:unhideWhenUsed/>
     <w:rsid w:val="00EA52CC"/>
@@ -2271,17 +2107,17 @@
       <w:spacing w:after="0" w:line="240" w:lineRule="auto"/>
     </w:pPr>
   </w:style>
-  <w:style w:type="character" w:customStyle="1" w:styleId="HeaderChar">
-    <w:name w:val="Header Char"/>
-    <w:basedOn w:val="DefaultParagraphFont"/>
-    <w:link w:val="Header"/>
+  <w:style w:type="character" w:customStyle="1" w:styleId="a5">
+    <w:name w:val="หัวกระดาษ อักขระ"/>
+    <w:basedOn w:val="a0"/>
+    <w:link w:val="a4"/>
     <w:uiPriority w:val="99"/>
     <w:rsid w:val="00EA52CC"/>
   </w:style>
-  <w:style w:type="paragraph" w:styleId="Footer">
+  <w:style w:type="paragraph" w:styleId="a6">
     <w:name w:val="footer"/>
-    <w:basedOn w:val="Normal"/>
-    <w:link w:val="FooterChar"/>
+    <w:basedOn w:val="a"/>
+    <w:link w:val="a7"/>
     <w:uiPriority w:val="99"/>
     <w:unhideWhenUsed/>
     <w:rsid w:val="00EA52CC"/>
@@ -2293,16 +2129,16 @@
       <w:spacing w:after="0" w:line="240" w:lineRule="auto"/>
     </w:pPr>
   </w:style>
-  <w:style w:type="character" w:customStyle="1" w:styleId="FooterChar">
-    <w:name w:val="Footer Char"/>
-    <w:basedOn w:val="DefaultParagraphFont"/>
-    <w:link w:val="Footer"/>
+  <w:style w:type="character" w:customStyle="1" w:styleId="a7">
+    <w:name w:val="ท้ายกระดาษ อักขระ"/>
+    <w:basedOn w:val="a0"/>
+    <w:link w:val="a6"/>
     <w:uiPriority w:val="99"/>
     <w:rsid w:val="00EA52CC"/>
   </w:style>
-  <w:style w:type="table" w:styleId="TableGrid">
+  <w:style w:type="table" w:styleId="a8">
     <w:name w:val="Table Grid"/>
-    <w:basedOn w:val="TableNormal"/>
+    <w:basedOn w:val="a1"/>
     <w:uiPriority w:val="39"/>
     <w:rsid w:val="00CD3705"/>
     <w:pPr>
@@ -2319,10 +2155,10 @@
       </w:tblBorders>
     </w:tblPr>
   </w:style>
-  <w:style w:type="character" w:customStyle="1" w:styleId="Heading1Char">
-    <w:name w:val="Heading 1 Char"/>
-    <w:basedOn w:val="DefaultParagraphFont"/>
-    <w:link w:val="Heading1"/>
+  <w:style w:type="character" w:customStyle="1" w:styleId="10">
+    <w:name w:val="หัวเรื่อง 1 อักขระ"/>
+    <w:basedOn w:val="a0"/>
+    <w:link w:val="1"/>
     <w:rsid w:val="009A19D5"/>
     <w:rPr>
       <w:rFonts w:ascii="Angsana New" w:eastAsia="Cordia New" w:hAnsi="Angsana New" w:cs="Angsana New"/>

</xml_diff>